<commit_message>
Update gap analysis: MCP metrics applicable to all 3 bots
All three bots (public, customer, private) use MCP for tool/resource
access. MCPUseMetric, MCPTaskCompletionMetric, and MultiTurnMCPUseMetric
moved from N/A to MISSING with P1/P2 priority. MCP scope enforcement
per bot added as a key test target.

Co-Authored-By: Claude Sonnet 4.6 <noreply@anthropic.com>
</commit_message>
<xml_diff>
--- a/docs/Multi_Bot_Strategy.docx
+++ b/docs/Multi_Bot_Strategy.docx
@@ -301,7 +301,7 @@
         <w:rPr>
           <w:b w:val="0"/>
         </w:rPr>
-        <w:t xml:space="preserve"> — answers from public knowledge base only</w:t>
+        <w:t xml:space="preserve"> — answers from public knowledge base only; MCP tools scoped to public resources</w:t>
       </w:r>
     </w:p>
     <w:p>
@@ -323,7 +323,7 @@
         <w:rPr>
           <w:b w:val="0"/>
         </w:rPr>
-        <w:t xml:space="preserve"> — answers from public KB + customer-specific KB</w:t>
+        <w:t xml:space="preserve"> — answers from public KB + customer-specific KB; MCP tools include customer resources</w:t>
       </w:r>
     </w:p>
     <w:p>
@@ -345,7 +345,15 @@
         <w:rPr>
           <w:b w:val="0"/>
         </w:rPr>
-        <w:t xml:space="preserve"> — full access: public KB + all customer KB</w:t>
+        <w:t xml:space="preserve"> — full access: public KB + all customer KB; MCP tools have full resource access</w:t>
+      </w:r>
+    </w:p>
+    <w:p>
+      <w:r>
+        <w:rPr>
+          <w:b w:val="0"/>
+        </w:rPr>
+        <w:t>All three bots use MCP (Model Context Protocol) for tool and resource access. MCP scope enforcement per bot is a key test target.</w:t>
       </w:r>
     </w:p>
     <w:p>
@@ -4052,6 +4060,7 @@
         <w:tc>
           <w:tcPr>
             <w:tcW w:type="dxa" w:w="2160"/>
+            <w:shd w:val="clear" w:color="auto" w:fill="FFF2CC"/>
           </w:tcPr>
           <w:p>
             <w:r/>
@@ -4110,6 +4119,7 @@
         <w:tc>
           <w:tcPr>
             <w:tcW w:type="dxa" w:w="2160"/>
+            <w:shd w:val="clear" w:color="auto" w:fill="FFF2CC"/>
           </w:tcPr>
           <w:p>
             <w:r/>
@@ -6860,7 +6870,15 @@
         <w:rPr>
           <w:b w:val="0"/>
         </w:rPr>
-        <w:t>#### MCP Metrics (3 total — Not Applicable)</w:t>
+        <w:t>#### MCP Metrics (3 total — All Applicable, All Missing)</w:t>
+      </w:r>
+    </w:p>
+    <w:p>
+      <w:r>
+        <w:rPr>
+          <w:b w:val="0"/>
+        </w:rPr>
+        <w:t>All three bots (Public, Customer, Private) use MCP (Model Context Protocol) for tool/resource access. These metrics are currently not evaluated at all.</w:t>
       </w:r>
     </w:p>
     <w:tbl>
@@ -6870,13 +6888,14 @@
         <w:tblLook w:firstColumn="1" w:firstRow="1" w:lastColumn="0" w:lastRow="0" w:noHBand="0" w:noVBand="1" w:val="04A0"/>
       </w:tblPr>
       <w:tblGrid>
-        <w:gridCol w:w="4320"/>
-        <w:gridCol w:w="4320"/>
+        <w:gridCol w:w="2880"/>
+        <w:gridCol w:w="2880"/>
+        <w:gridCol w:w="2880"/>
       </w:tblGrid>
       <w:tr>
         <w:tc>
           <w:tcPr>
-            <w:tcW w:type="dxa" w:w="4320"/>
+            <w:tcW w:type="dxa" w:w="2880"/>
             <w:shd w:val="clear" w:color="auto" w:fill="BDD7EE"/>
           </w:tcPr>
           <w:p>
@@ -6891,7 +6910,7 @@
         </w:tc>
         <w:tc>
           <w:tcPr>
-            <w:tcW w:type="dxa" w:w="4320"/>
+            <w:tcW w:type="dxa" w:w="2880"/>
             <w:shd w:val="clear" w:color="auto" w:fill="BDD7EE"/>
           </w:tcPr>
           <w:p>
@@ -6900,7 +6919,22 @@
               <w:rPr>
                 <w:b/>
               </w:rPr>
-              <w:t>Status</w:t>
+              <w:t>Covered?</w:t>
+            </w:r>
+          </w:p>
+        </w:tc>
+        <w:tc>
+          <w:tcPr>
+            <w:tcW w:type="dxa" w:w="2880"/>
+            <w:shd w:val="clear" w:color="auto" w:fill="BDD7EE"/>
+          </w:tcPr>
+          <w:p>
+            <w:r/>
+            <w:r>
+              <w:rPr>
+                <w:b/>
+              </w:rPr>
+              <w:t>Gap / Note</w:t>
             </w:r>
           </w:p>
         </w:tc>
@@ -6908,29 +6942,75 @@
       <w:tr>
         <w:tc>
           <w:tcPr>
-            <w:tcW w:type="dxa" w:w="4320"/>
-          </w:tcPr>
-          <w:p>
-            <w:r/>
-            <w:r>
-              <w:rPr>
-                <w:b w:val="0"/>
+            <w:tcW w:type="dxa" w:w="2880"/>
+          </w:tcPr>
+          <w:p>
+            <w:r/>
+            <w:r>
+              <w:rPr>
+                <w:b w:val="0"/>
+              </w:rPr>
+            </w:r>
+            <w:r>
+              <w:rPr>
+                <w:b/>
               </w:rPr>
               <w:t>MCPTaskCompletionMetric</w:t>
             </w:r>
-          </w:p>
-        </w:tc>
-        <w:tc>
-          <w:tcPr>
-            <w:tcW w:type="dxa" w:w="4320"/>
-          </w:tcPr>
-          <w:p>
-            <w:r/>
-            <w:r>
-              <w:rPr>
-                <w:b w:val="0"/>
-              </w:rPr>
-              <w:t>N/A — not using MCP protocol</w:t>
+            <w:r>
+              <w:rPr>
+                <w:b w:val="0"/>
+              </w:rPr>
+            </w:r>
+          </w:p>
+        </w:tc>
+        <w:tc>
+          <w:tcPr>
+            <w:tcW w:type="dxa" w:w="2880"/>
+          </w:tcPr>
+          <w:p>
+            <w:r/>
+            <w:r>
+              <w:rPr>
+                <w:b w:val="0"/>
+              </w:rPr>
+            </w:r>
+            <w:r>
+              <w:rPr>
+                <w:b/>
+              </w:rPr>
+              <w:t>NO</w:t>
+            </w:r>
+            <w:r>
+              <w:rPr>
+                <w:b w:val="0"/>
+              </w:rPr>
+            </w:r>
+          </w:p>
+        </w:tc>
+        <w:tc>
+          <w:tcPr>
+            <w:tcW w:type="dxa" w:w="2880"/>
+            <w:shd w:val="clear" w:color="auto" w:fill="FCE4D6"/>
+          </w:tcPr>
+          <w:p>
+            <w:r/>
+            <w:r>
+              <w:rPr>
+                <w:b w:val="0"/>
+              </w:rPr>
+            </w:r>
+            <w:r>
+              <w:rPr>
+                <w:b/>
+              </w:rPr>
+              <w:t>MISSING</w:t>
+            </w:r>
+            <w:r>
+              <w:rPr>
+                <w:b w:val="0"/>
+              </w:rPr>
+              <w:t xml:space="preserve"> — did the bot complete its task using MCP tools? Each bot has different MCP tool access scope</w:t>
             </w:r>
           </w:p>
         </w:tc>
@@ -6938,29 +7018,75 @@
       <w:tr>
         <w:tc>
           <w:tcPr>
-            <w:tcW w:type="dxa" w:w="4320"/>
-          </w:tcPr>
-          <w:p>
-            <w:r/>
-            <w:r>
-              <w:rPr>
-                <w:b w:val="0"/>
+            <w:tcW w:type="dxa" w:w="2880"/>
+          </w:tcPr>
+          <w:p>
+            <w:r/>
+            <w:r>
+              <w:rPr>
+                <w:b w:val="0"/>
+              </w:rPr>
+            </w:r>
+            <w:r>
+              <w:rPr>
+                <w:b/>
               </w:rPr>
               <w:t>MCPUseMetric</w:t>
             </w:r>
-          </w:p>
-        </w:tc>
-        <w:tc>
-          <w:tcPr>
-            <w:tcW w:type="dxa" w:w="4320"/>
-          </w:tcPr>
-          <w:p>
-            <w:r/>
-            <w:r>
-              <w:rPr>
-                <w:b w:val="0"/>
-              </w:rPr>
-              <w:t>N/A</w:t>
+            <w:r>
+              <w:rPr>
+                <w:b w:val="0"/>
+              </w:rPr>
+            </w:r>
+          </w:p>
+        </w:tc>
+        <w:tc>
+          <w:tcPr>
+            <w:tcW w:type="dxa" w:w="2880"/>
+          </w:tcPr>
+          <w:p>
+            <w:r/>
+            <w:r>
+              <w:rPr>
+                <w:b w:val="0"/>
+              </w:rPr>
+            </w:r>
+            <w:r>
+              <w:rPr>
+                <w:b/>
+              </w:rPr>
+              <w:t>NO</w:t>
+            </w:r>
+            <w:r>
+              <w:rPr>
+                <w:b w:val="0"/>
+              </w:rPr>
+            </w:r>
+          </w:p>
+        </w:tc>
+        <w:tc>
+          <w:tcPr>
+            <w:tcW w:type="dxa" w:w="2880"/>
+            <w:shd w:val="clear" w:color="auto" w:fill="FCE4D6"/>
+          </w:tcPr>
+          <w:p>
+            <w:r/>
+            <w:r>
+              <w:rPr>
+                <w:b w:val="0"/>
+              </w:rPr>
+            </w:r>
+            <w:r>
+              <w:rPr>
+                <w:b/>
+              </w:rPr>
+              <w:t>MISSING</w:t>
+            </w:r>
+            <w:r>
+              <w:rPr>
+                <w:b w:val="0"/>
+              </w:rPr>
+              <w:t xml:space="preserve"> — validates correct MCP tool/resource/prompt usage. Critical for verifying KB scope enforcement (customer bot should only use customer MCP resources)</w:t>
             </w:r>
           </w:p>
         </w:tc>
@@ -6968,29 +7094,75 @@
       <w:tr>
         <w:tc>
           <w:tcPr>
-            <w:tcW w:type="dxa" w:w="4320"/>
-          </w:tcPr>
-          <w:p>
-            <w:r/>
-            <w:r>
-              <w:rPr>
-                <w:b w:val="0"/>
+            <w:tcW w:type="dxa" w:w="2880"/>
+          </w:tcPr>
+          <w:p>
+            <w:r/>
+            <w:r>
+              <w:rPr>
+                <w:b w:val="0"/>
+              </w:rPr>
+            </w:r>
+            <w:r>
+              <w:rPr>
+                <w:b/>
               </w:rPr>
               <w:t>MultiTurnMCPUseMetric</w:t>
             </w:r>
-          </w:p>
-        </w:tc>
-        <w:tc>
-          <w:tcPr>
-            <w:tcW w:type="dxa" w:w="4320"/>
-          </w:tcPr>
-          <w:p>
-            <w:r/>
-            <w:r>
-              <w:rPr>
-                <w:b w:val="0"/>
-              </w:rPr>
-              <w:t>N/A</w:t>
+            <w:r>
+              <w:rPr>
+                <w:b w:val="0"/>
+              </w:rPr>
+            </w:r>
+          </w:p>
+        </w:tc>
+        <w:tc>
+          <w:tcPr>
+            <w:tcW w:type="dxa" w:w="2880"/>
+          </w:tcPr>
+          <w:p>
+            <w:r/>
+            <w:r>
+              <w:rPr>
+                <w:b w:val="0"/>
+              </w:rPr>
+            </w:r>
+            <w:r>
+              <w:rPr>
+                <w:b/>
+              </w:rPr>
+              <w:t>NO</w:t>
+            </w:r>
+            <w:r>
+              <w:rPr>
+                <w:b w:val="0"/>
+              </w:rPr>
+            </w:r>
+          </w:p>
+        </w:tc>
+        <w:tc>
+          <w:tcPr>
+            <w:tcW w:type="dxa" w:w="2880"/>
+            <w:shd w:val="clear" w:color="auto" w:fill="FCE4D6"/>
+          </w:tcPr>
+          <w:p>
+            <w:r/>
+            <w:r>
+              <w:rPr>
+                <w:b w:val="0"/>
+              </w:rPr>
+            </w:r>
+            <w:r>
+              <w:rPr>
+                <w:b/>
+              </w:rPr>
+              <w:t>MISSING</w:t>
+            </w:r>
+            <w:r>
+              <w:rPr>
+                <w:b w:val="0"/>
+              </w:rPr>
+              <w:t xml:space="preserve"> — evaluates MCP usage patterns across a full multi-turn session. Important for detecting KB boundary leaks across conversation turns</w:t>
             </w:r>
           </w:p>
         </w:tc>
@@ -8351,6 +8523,168 @@
                 <w:b w:val="0"/>
               </w:rPr>
               <w:t>Full multi-turn evaluation (TurnRelevancy, TurnFaithfulness, etc.)</w:t>
+            </w:r>
+          </w:p>
+        </w:tc>
+      </w:tr>
+      <w:tr>
+        <w:tc>
+          <w:tcPr>
+            <w:tcW w:type="dxa" w:w="2880"/>
+          </w:tcPr>
+          <w:p>
+            <w:r/>
+            <w:r>
+              <w:rPr>
+                <w:b w:val="0"/>
+              </w:rPr>
+            </w:r>
+            <w:r>
+              <w:rPr>
+                <w:b/>
+              </w:rPr>
+              <w:t>P1</w:t>
+            </w:r>
+            <w:r>
+              <w:rPr>
+                <w:b w:val="0"/>
+              </w:rPr>
+            </w:r>
+          </w:p>
+        </w:tc>
+        <w:tc>
+          <w:tcPr>
+            <w:tcW w:type="dxa" w:w="2880"/>
+          </w:tcPr>
+          <w:p>
+            <w:r/>
+            <w:r>
+              <w:rPr>
+                <w:b w:val="0"/>
+              </w:rPr>
+              <w:t>MCPUseMetric</w:t>
+            </w:r>
+          </w:p>
+        </w:tc>
+        <w:tc>
+          <w:tcPr>
+            <w:tcW w:type="dxa" w:w="2880"/>
+          </w:tcPr>
+          <w:p>
+            <w:r/>
+            <w:r>
+              <w:rPr>
+                <w:b w:val="0"/>
+              </w:rPr>
+              <w:t>All 3 bots use MCP — verify correct MCP resource/tool usage per bot scope</w:t>
+            </w:r>
+          </w:p>
+        </w:tc>
+      </w:tr>
+      <w:tr>
+        <w:tc>
+          <w:tcPr>
+            <w:tcW w:type="dxa" w:w="2880"/>
+          </w:tcPr>
+          <w:p>
+            <w:r/>
+            <w:r>
+              <w:rPr>
+                <w:b w:val="0"/>
+              </w:rPr>
+            </w:r>
+            <w:r>
+              <w:rPr>
+                <w:b/>
+              </w:rPr>
+              <w:t>P1</w:t>
+            </w:r>
+            <w:r>
+              <w:rPr>
+                <w:b w:val="0"/>
+              </w:rPr>
+            </w:r>
+          </w:p>
+        </w:tc>
+        <w:tc>
+          <w:tcPr>
+            <w:tcW w:type="dxa" w:w="2880"/>
+          </w:tcPr>
+          <w:p>
+            <w:r/>
+            <w:r>
+              <w:rPr>
+                <w:b w:val="0"/>
+              </w:rPr>
+              <w:t>MCPTaskCompletionMetric</w:t>
+            </w:r>
+          </w:p>
+        </w:tc>
+        <w:tc>
+          <w:tcPr>
+            <w:tcW w:type="dxa" w:w="2880"/>
+          </w:tcPr>
+          <w:p>
+            <w:r/>
+            <w:r>
+              <w:rPr>
+                <w:b w:val="0"/>
+              </w:rPr>
+              <w:t>Did the bot complete its task via MCP tools?</w:t>
+            </w:r>
+          </w:p>
+        </w:tc>
+      </w:tr>
+      <w:tr>
+        <w:tc>
+          <w:tcPr>
+            <w:tcW w:type="dxa" w:w="2880"/>
+          </w:tcPr>
+          <w:p>
+            <w:r/>
+            <w:r>
+              <w:rPr>
+                <w:b w:val="0"/>
+              </w:rPr>
+            </w:r>
+            <w:r>
+              <w:rPr>
+                <w:b/>
+              </w:rPr>
+              <w:t>P2</w:t>
+            </w:r>
+            <w:r>
+              <w:rPr>
+                <w:b w:val="0"/>
+              </w:rPr>
+            </w:r>
+          </w:p>
+        </w:tc>
+        <w:tc>
+          <w:tcPr>
+            <w:tcW w:type="dxa" w:w="2880"/>
+          </w:tcPr>
+          <w:p>
+            <w:r/>
+            <w:r>
+              <w:rPr>
+                <w:b w:val="0"/>
+              </w:rPr>
+              <w:t>MultiTurnMCPUseMetric</w:t>
+            </w:r>
+          </w:p>
+        </w:tc>
+        <w:tc>
+          <w:tcPr>
+            <w:tcW w:type="dxa" w:w="2880"/>
+          </w:tcPr>
+          <w:p>
+            <w:r/>
+            <w:r>
+              <w:rPr>
+                <w:b w:val="0"/>
+              </w:rPr>
+              <w:t>Detect KB boundary leaks via MCP across conversation turns</w:t>
             </w:r>
           </w:p>
         </w:tc>

</xml_diff>

<commit_message>
Add load testing dashboard integration section to strategy doc
Documents why agent_load_details_*.json does not appear on dashboard
latency page (wrong file name, flat latency_seconds vs span timestamps),
and the non-disruptive bridge script approach that keeps existing load
test scripts unchanged. Per-bot load test project isolation included.

Co-Authored-By: Claude Sonnet 4.6 <noreply@anthropic.com>
</commit_message>
<xml_diff>
--- a/docs/Multi_Bot_Strategy.docx
+++ b/docs/Multi_Bot_Strategy.docx
@@ -10181,6 +10181,1359 @@
         <w:t xml:space="preserve"> with MULTICONTEXT evolution would auto-generate cross-document test cases that test KB boundary enforcement — exactly what the multi-bot scenario needs.</w:t>
       </w:r>
     </w:p>
+    <w:p>
+      <w:r>
+        <w:t>────────────────────────────────────────────────────────────</w:t>
+      </w:r>
+    </w:p>
+    <w:p>
+      <w:r>
+        <w:t>────────────────────────────────────────────────────────────</w:t>
+      </w:r>
+    </w:p>
+    <w:p>
+      <w:pPr>
+        <w:pStyle w:val="Heading2"/>
+      </w:pPr>
+      <w:r>
+        <w:rPr>
+          <w:b/>
+          <w:color w:val="2E75B6"/>
+          <w:sz w:val="30"/>
+        </w:rPr>
+        <w:t>Load Testing — Dashboard Integration</w:t>
+      </w:r>
+    </w:p>
+    <w:p>
+      <w:pPr>
+        <w:pStyle w:val="Heading3"/>
+      </w:pPr>
+      <w:r>
+        <w:rPr>
+          <w:b/>
+          <w:color w:val="404040"/>
+          <w:sz w:val="26"/>
+        </w:rPr>
+        <w:t>Current State</w:t>
+      </w:r>
+    </w:p>
+    <w:p>
+      <w:r>
+        <w:rPr>
+          <w:b w:val="0"/>
+        </w:rPr>
+        <w:t xml:space="preserve">The PlayReady QA project has </w:t>
+      </w:r>
+      <w:r>
+        <w:rPr>
+          <w:rFonts w:ascii="Courier New" w:hAnsi="Courier New"/>
+          <w:b w:val="0"/>
+          <w:sz w:val="20"/>
+        </w:rPr>
+        <w:t>scripts/run_agent_load_test.py</w:t>
+      </w:r>
+      <w:r>
+        <w:rPr>
+          <w:b w:val="0"/>
+        </w:rPr>
+        <w:t xml:space="preserve"> which runs concurrent load tests against the Azure Foundry agent endpoint. It produces:</w:t>
+      </w:r>
+    </w:p>
+    <w:tbl>
+      <w:tblPr>
+        <w:tblStyle w:val="TableGrid"/>
+        <w:tblW w:type="auto" w:w="0"/>
+        <w:tblLook w:firstColumn="1" w:firstRow="1" w:lastColumn="0" w:lastRow="0" w:noHBand="0" w:noVBand="1" w:val="04A0"/>
+      </w:tblPr>
+      <w:tblGrid>
+        <w:gridCol w:w="4320"/>
+        <w:gridCol w:w="4320"/>
+      </w:tblGrid>
+      <w:tr>
+        <w:tc>
+          <w:tcPr>
+            <w:tcW w:type="dxa" w:w="4320"/>
+            <w:shd w:val="clear" w:color="auto" w:fill="BDD7EE"/>
+          </w:tcPr>
+          <w:p>
+            <w:r/>
+            <w:r>
+              <w:rPr>
+                <w:b/>
+              </w:rPr>
+              <w:t>Output File</w:t>
+            </w:r>
+          </w:p>
+        </w:tc>
+        <w:tc>
+          <w:tcPr>
+            <w:tcW w:type="dxa" w:w="4320"/>
+            <w:shd w:val="clear" w:color="auto" w:fill="BDD7EE"/>
+          </w:tcPr>
+          <w:p>
+            <w:r/>
+            <w:r>
+              <w:rPr>
+                <w:b/>
+              </w:rPr>
+              <w:t>Contents</w:t>
+            </w:r>
+          </w:p>
+        </w:tc>
+      </w:tr>
+      <w:tr>
+        <w:tc>
+          <w:tcPr>
+            <w:tcW w:type="dxa" w:w="4320"/>
+          </w:tcPr>
+          <w:p>
+            <w:r/>
+            <w:r>
+              <w:rPr>
+                <w:b w:val="0"/>
+              </w:rPr>
+              <w:t>`agent_load_summary_TIMESTAMP.json`</w:t>
+            </w:r>
+          </w:p>
+        </w:tc>
+        <w:tc>
+          <w:tcPr>
+            <w:tcW w:type="dxa" w:w="4320"/>
+          </w:tcPr>
+          <w:p>
+            <w:r/>
+            <w:r>
+              <w:rPr>
+                <w:b w:val="0"/>
+              </w:rPr>
+              <w:t>Overall stats — P50/P95/P99, throughput, SLA evaluation, RCA, recommendations</w:t>
+            </w:r>
+          </w:p>
+        </w:tc>
+      </w:tr>
+      <w:tr>
+        <w:tc>
+          <w:tcPr>
+            <w:tcW w:type="dxa" w:w="4320"/>
+          </w:tcPr>
+          <w:p>
+            <w:r/>
+            <w:r>
+              <w:rPr>
+                <w:b w:val="0"/>
+              </w:rPr>
+              <w:t>`agent_load_details_TIMESTAMP.json`</w:t>
+            </w:r>
+          </w:p>
+        </w:tc>
+        <w:tc>
+          <w:tcPr>
+            <w:tcW w:type="dxa" w:w="4320"/>
+          </w:tcPr>
+          <w:p>
+            <w:r/>
+            <w:r>
+              <w:rPr>
+                <w:b w:val="0"/>
+              </w:rPr>
+              <w:t>Per-request records — `latency_seconds`, `token_usage`, `run_status`, `error_type`</w:t>
+            </w:r>
+          </w:p>
+        </w:tc>
+      </w:tr>
+      <w:tr>
+        <w:tc>
+          <w:tcPr>
+            <w:tcW w:type="dxa" w:w="4320"/>
+          </w:tcPr>
+          <w:p>
+            <w:r/>
+            <w:r>
+              <w:rPr>
+                <w:b w:val="0"/>
+              </w:rPr>
+              <w:t>`agent_load_details_TIMESTAMP.csv`</w:t>
+            </w:r>
+          </w:p>
+        </w:tc>
+        <w:tc>
+          <w:tcPr>
+            <w:tcW w:type="dxa" w:w="4320"/>
+          </w:tcPr>
+          <w:p>
+            <w:r/>
+            <w:r>
+              <w:rPr>
+                <w:b w:val="0"/>
+              </w:rPr>
+              <w:t>Flattened CSV version</w:t>
+            </w:r>
+          </w:p>
+        </w:tc>
+      </w:tr>
+      <w:tr>
+        <w:tc>
+          <w:tcPr>
+            <w:tcW w:type="dxa" w:w="4320"/>
+          </w:tcPr>
+          <w:p>
+            <w:r/>
+            <w:r>
+              <w:rPr>
+                <w:b w:val="0"/>
+              </w:rPr>
+              <w:t>`agent_load_bridge_TIMESTAMP.xlsx`</w:t>
+            </w:r>
+          </w:p>
+        </w:tc>
+        <w:tc>
+          <w:tcPr>
+            <w:tcW w:type="dxa" w:w="4320"/>
+          </w:tcPr>
+          <w:p>
+            <w:r/>
+            <w:r>
+              <w:rPr>
+                <w:b w:val="0"/>
+              </w:rPr>
+              <w:t>Excel report with latency percentiles, SLA, errors</w:t>
+            </w:r>
+          </w:p>
+        </w:tc>
+      </w:tr>
+    </w:tbl>
+    <w:p/>
+    <w:p>
+      <w:r>
+        <w:rPr>
+          <w:b w:val="0"/>
+        </w:rPr>
+      </w:r>
+      <w:r>
+        <w:rPr>
+          <w:b/>
+        </w:rPr>
+        <w:t>Problem:</w:t>
+      </w:r>
+      <w:r>
+        <w:rPr>
+          <w:b w:val="0"/>
+        </w:rPr>
+        <w:t xml:space="preserve"> These results are not appearing on the dashboard Latency page.</w:t>
+      </w:r>
+    </w:p>
+    <w:p>
+      <w:r>
+        <w:t>────────────────────────────────────────────────────────────</w:t>
+      </w:r>
+    </w:p>
+    <w:p>
+      <w:pPr>
+        <w:pStyle w:val="Heading3"/>
+      </w:pPr>
+      <w:r>
+        <w:rPr>
+          <w:b/>
+          <w:color w:val="404040"/>
+          <w:sz w:val="26"/>
+        </w:rPr>
+        <w:t>Why It Does Not Show on the Dashboard</w:t>
+      </w:r>
+    </w:p>
+    <w:p>
+      <w:r>
+        <w:rPr>
+          <w:b w:val="0"/>
+        </w:rPr>
+        <w:t xml:space="preserve">The dashboard Latency page reads latency exclusively from </w:t>
+      </w:r>
+      <w:r>
+        <w:rPr>
+          <w:b/>
+        </w:rPr>
+        <w:t>span timestamps</w:t>
+      </w:r>
+      <w:r>
+        <w:rPr>
+          <w:b w:val="0"/>
+        </w:rPr>
+        <w:t xml:space="preserve"> nested inside </w:t>
+      </w:r>
+      <w:r>
+        <w:rPr>
+          <w:rFonts w:ascii="Courier New" w:hAnsi="Courier New"/>
+          <w:b w:val="0"/>
+          <w:sz w:val="20"/>
+        </w:rPr>
+        <w:t>trace.llmSpans[].startTime</w:t>
+      </w:r>
+      <w:r>
+        <w:rPr>
+          <w:b w:val="0"/>
+        </w:rPr>
+        <w:t xml:space="preserve"> and </w:t>
+      </w:r>
+      <w:r>
+        <w:rPr>
+          <w:rFonts w:ascii="Courier New" w:hAnsi="Courier New"/>
+          <w:b w:val="0"/>
+          <w:sz w:val="20"/>
+        </w:rPr>
+        <w:t>endTime</w:t>
+      </w:r>
+      <w:r>
+        <w:rPr>
+          <w:b w:val="0"/>
+        </w:rPr>
+        <w:t xml:space="preserve"> (ISO8601). The load test outputs a flat </w:t>
+      </w:r>
+      <w:r>
+        <w:rPr>
+          <w:rFonts w:ascii="Courier New" w:hAnsi="Courier New"/>
+          <w:b w:val="0"/>
+          <w:sz w:val="20"/>
+        </w:rPr>
+        <w:t>latency_seconds</w:t>
+      </w:r>
+      <w:r>
+        <w:rPr>
+          <w:b w:val="0"/>
+        </w:rPr>
+        <w:t xml:space="preserve"> number in files with the wrong name.</w:t>
+      </w:r>
+    </w:p>
+    <w:tbl>
+      <w:tblPr>
+        <w:tblStyle w:val="TableGrid"/>
+        <w:tblW w:type="auto" w:w="0"/>
+        <w:tblLook w:firstColumn="1" w:firstRow="1" w:lastColumn="0" w:lastRow="0" w:noHBand="0" w:noVBand="1" w:val="04A0"/>
+      </w:tblPr>
+      <w:tblGrid>
+        <w:gridCol w:w="2880"/>
+        <w:gridCol w:w="2880"/>
+        <w:gridCol w:w="2880"/>
+      </w:tblGrid>
+      <w:tr>
+        <w:tc>
+          <w:tcPr>
+            <w:tcW w:type="dxa" w:w="2880"/>
+            <w:shd w:val="clear" w:color="auto" w:fill="BDD7EE"/>
+          </w:tcPr>
+          <w:p>
+            <w:r/>
+            <w:r>
+              <w:rPr>
+                <w:b/>
+              </w:rPr>
+              <w:t>Issue</w:t>
+            </w:r>
+          </w:p>
+        </w:tc>
+        <w:tc>
+          <w:tcPr>
+            <w:tcW w:type="dxa" w:w="2880"/>
+            <w:shd w:val="clear" w:color="auto" w:fill="BDD7EE"/>
+          </w:tcPr>
+          <w:p>
+            <w:r/>
+            <w:r>
+              <w:rPr>
+                <w:b/>
+              </w:rPr>
+              <w:t>Load Test Output</w:t>
+            </w:r>
+          </w:p>
+        </w:tc>
+        <w:tc>
+          <w:tcPr>
+            <w:tcW w:type="dxa" w:w="2880"/>
+            <w:shd w:val="clear" w:color="auto" w:fill="BDD7EE"/>
+          </w:tcPr>
+          <w:p>
+            <w:r/>
+            <w:r>
+              <w:rPr>
+                <w:b/>
+              </w:rPr>
+              <w:t>Dashboard Expects</w:t>
+            </w:r>
+          </w:p>
+        </w:tc>
+      </w:tr>
+      <w:tr>
+        <w:tc>
+          <w:tcPr>
+            <w:tcW w:type="dxa" w:w="2880"/>
+          </w:tcPr>
+          <w:p>
+            <w:r/>
+            <w:r>
+              <w:rPr>
+                <w:b w:val="0"/>
+              </w:rPr>
+              <w:t>File name</w:t>
+            </w:r>
+          </w:p>
+        </w:tc>
+        <w:tc>
+          <w:tcPr>
+            <w:tcW w:type="dxa" w:w="2880"/>
+          </w:tcPr>
+          <w:p>
+            <w:r/>
+            <w:r>
+              <w:rPr>
+                <w:b w:val="0"/>
+              </w:rPr>
+              <w:t>`agent_load_details_*.json`</w:t>
+            </w:r>
+          </w:p>
+        </w:tc>
+        <w:tc>
+          <w:tcPr>
+            <w:tcW w:type="dxa" w:w="2880"/>
+          </w:tcPr>
+          <w:p>
+            <w:r/>
+            <w:r>
+              <w:rPr>
+                <w:b w:val="0"/>
+              </w:rPr>
+              <w:t>`test_run_*.json`</w:t>
+            </w:r>
+          </w:p>
+        </w:tc>
+      </w:tr>
+      <w:tr>
+        <w:tc>
+          <w:tcPr>
+            <w:tcW w:type="dxa" w:w="2880"/>
+          </w:tcPr>
+          <w:p>
+            <w:r/>
+            <w:r>
+              <w:rPr>
+                <w:b w:val="0"/>
+              </w:rPr>
+              <w:t>Latency format</w:t>
+            </w:r>
+          </w:p>
+        </w:tc>
+        <w:tc>
+          <w:tcPr>
+            <w:tcW w:type="dxa" w:w="2880"/>
+          </w:tcPr>
+          <w:p>
+            <w:r/>
+            <w:r>
+              <w:rPr>
+                <w:b w:val="0"/>
+              </w:rPr>
+              <w:t>`"latency_seconds": 5.2` (flat float)</w:t>
+            </w:r>
+          </w:p>
+        </w:tc>
+        <w:tc>
+          <w:tcPr>
+            <w:tcW w:type="dxa" w:w="2880"/>
+          </w:tcPr>
+          <w:p>
+            <w:r/>
+            <w:r>
+              <w:rPr>
+                <w:b w:val="0"/>
+              </w:rPr>
+              <w:t>`startTime` + `endTime` ISO8601 on each span</w:t>
+            </w:r>
+          </w:p>
+        </w:tc>
+      </w:tr>
+      <w:tr>
+        <w:tc>
+          <w:tcPr>
+            <w:tcW w:type="dxa" w:w="2880"/>
+          </w:tcPr>
+          <w:p>
+            <w:r/>
+            <w:r>
+              <w:rPr>
+                <w:b w:val="0"/>
+              </w:rPr>
+              <w:t>Structure</w:t>
+            </w:r>
+          </w:p>
+        </w:tc>
+        <w:tc>
+          <w:tcPr>
+            <w:tcW w:type="dxa" w:w="2880"/>
+          </w:tcPr>
+          <w:p>
+            <w:r/>
+            <w:r>
+              <w:rPr>
+                <w:b w:val="0"/>
+              </w:rPr>
+              <w:t>Flat request list</w:t>
+            </w:r>
+          </w:p>
+        </w:tc>
+        <w:tc>
+          <w:tcPr>
+            <w:tcW w:type="dxa" w:w="2880"/>
+          </w:tcPr>
+          <w:p>
+            <w:r/>
+            <w:r>
+              <w:rPr>
+                <w:b w:val="0"/>
+              </w:rPr>
+              <w:t>`testCases[].trace.llmSpans[]`</w:t>
+            </w:r>
+          </w:p>
+        </w:tc>
+      </w:tr>
+      <w:tr>
+        <w:tc>
+          <w:tcPr>
+            <w:tcW w:type="dxa" w:w="2880"/>
+          </w:tcPr>
+          <w:p>
+            <w:r/>
+            <w:r>
+              <w:rPr>
+                <w:b w:val="0"/>
+              </w:rPr>
+              <w:t>Span types</w:t>
+            </w:r>
+          </w:p>
+        </w:tc>
+        <w:tc>
+          <w:tcPr>
+            <w:tcW w:type="dxa" w:w="2880"/>
+          </w:tcPr>
+          <w:p>
+            <w:r/>
+            <w:r>
+              <w:rPr>
+                <w:b w:val="0"/>
+              </w:rPr>
+              <w:t>None</w:t>
+            </w:r>
+          </w:p>
+        </w:tc>
+        <w:tc>
+          <w:tcPr>
+            <w:tcW w:type="dxa" w:w="2880"/>
+          </w:tcPr>
+          <w:p>
+            <w:r/>
+            <w:r>
+              <w:rPr>
+                <w:b w:val="0"/>
+              </w:rPr>
+              <w:t>`llm`, `retriever`, `tool`, `agent`, `base`</w:t>
+            </w:r>
+          </w:p>
+        </w:tc>
+      </w:tr>
+    </w:tbl>
+    <w:p/>
+    <w:p>
+      <w:r>
+        <w:rPr>
+          <w:b w:val="0"/>
+        </w:rPr>
+        <w:t>The dashboard's aggregator (</w:t>
+      </w:r>
+      <w:r>
+        <w:rPr>
+          <w:rFonts w:ascii="Courier New" w:hAnsi="Courier New"/>
+          <w:b w:val="0"/>
+          <w:sz w:val="20"/>
+        </w:rPr>
+        <w:t>aggregator.py</w:t>
+      </w:r>
+      <w:r>
+        <w:rPr>
+          <w:b w:val="0"/>
+        </w:rPr>
+        <w:t>) computes latency as:</w:t>
+      </w:r>
+    </w:p>
+    <w:p>
+      <w:pPr>
+        <w:ind w:left="432"/>
+        <w:shd w:val="clear" w:color="auto" w:fill="F2F2F2"/>
+      </w:pPr>
+      <w:r>
+        <w:rPr>
+          <w:rFonts w:ascii="Courier New" w:hAnsi="Courier New"/>
+          <w:sz w:val="18"/>
+        </w:rPr>
+        <w:t>duration_ms = (datetime.fromisoformat(endTime) - datetime.fromisoformat(startTime)) * 1000</w:t>
+      </w:r>
+    </w:p>
+    <w:p>
+      <w:r>
+        <w:rPr>
+          <w:b w:val="0"/>
+        </w:rPr>
+        <w:t xml:space="preserve">It only reads files named </w:t>
+      </w:r>
+      <w:r>
+        <w:rPr>
+          <w:rFonts w:ascii="Courier New" w:hAnsi="Courier New"/>
+          <w:b w:val="0"/>
+          <w:sz w:val="20"/>
+        </w:rPr>
+        <w:t>test_run_*.json</w:t>
+      </w:r>
+      <w:r>
+        <w:rPr>
+          <w:b w:val="0"/>
+        </w:rPr>
+        <w:t xml:space="preserve"> from </w:t>
+      </w:r>
+      <w:r>
+        <w:rPr>
+          <w:rFonts w:ascii="Courier New" w:hAnsi="Courier New"/>
+          <w:b w:val="0"/>
+          <w:sz w:val="20"/>
+        </w:rPr>
+        <w:t>eval_history/</w:t>
+      </w:r>
+      <w:r>
+        <w:rPr>
+          <w:b w:val="0"/>
+        </w:rPr>
+        <w:t>. Load test files never reach it.</w:t>
+      </w:r>
+    </w:p>
+    <w:p>
+      <w:r>
+        <w:t>────────────────────────────────────────────────────────────</w:t>
+      </w:r>
+    </w:p>
+    <w:p>
+      <w:pPr>
+        <w:pStyle w:val="Heading3"/>
+      </w:pPr>
+      <w:r>
+        <w:rPr>
+          <w:b/>
+          <w:color w:val="404040"/>
+          <w:sz w:val="26"/>
+        </w:rPr>
+        <w:t>Integration Approach — Non-Disruptive Bridge</w:t>
+      </w:r>
+    </w:p>
+    <w:p>
+      <w:r>
+        <w:rPr>
+          <w:b w:val="0"/>
+        </w:rPr>
+        <w:t xml:space="preserve">The fix is a </w:t>
+      </w:r>
+      <w:r>
+        <w:rPr>
+          <w:b/>
+        </w:rPr>
+        <w:t>bridge script</w:t>
+      </w:r>
+      <w:r>
+        <w:rPr>
+          <w:b w:val="0"/>
+        </w:rPr>
+        <w:t xml:space="preserve"> that converts what the load test already produces into what the dashboard expects. Zero changes to </w:t>
+      </w:r>
+      <w:r>
+        <w:rPr>
+          <w:rFonts w:ascii="Courier New" w:hAnsi="Courier New"/>
+          <w:b w:val="0"/>
+          <w:sz w:val="20"/>
+        </w:rPr>
+        <w:t>run_agent_load_test.py</w:t>
+      </w:r>
+      <w:r>
+        <w:rPr>
+          <w:b w:val="0"/>
+        </w:rPr>
+        <w:t xml:space="preserve"> or the existing RAGAS/Foundry eval pipeline.</w:t>
+      </w:r>
+    </w:p>
+    <w:p>
+      <w:pPr>
+        <w:ind w:left="432"/>
+        <w:shd w:val="clear" w:color="auto" w:fill="F2F2F2"/>
+      </w:pPr>
+      <w:r>
+        <w:rPr>
+          <w:rFonts w:ascii="Courier New" w:hAnsi="Courier New"/>
+          <w:sz w:val="18"/>
+        </w:rPr>
+        <w:t>run_agent_load_test.py              (unchanged)</w:t>
+        <w:br/>
+        <w:t xml:space="preserve">        |</w:t>
+        <w:br/>
+        <w:t xml:space="preserve">        v</w:t>
+        <w:br/>
+        <w:t>agent_load_details_TIMESTAMP.json   (unchanged output)</w:t>
+        <w:br/>
+        <w:t xml:space="preserve">        |</w:t>
+        <w:br/>
+        <w:t xml:space="preserve">        v</w:t>
+        <w:br/>
+        <w:t>scripts/load_test_to_dashboard.py   ← NEW bridge script</w:t>
+        <w:br/>
+        <w:t xml:space="preserve">        |</w:t>
+        <w:br/>
+        <w:t xml:space="preserve">        v</w:t>
+        <w:br/>
+        <w:t>eval_history/test_run_loadtest_TIMESTAMP.json</w:t>
+        <w:br/>
+        <w:t xml:space="preserve">        |</w:t>
+        <w:br/>
+        <w:t xml:space="preserve">        v</w:t>
+        <w:br/>
+        <w:t>Dashboard Latency Page              (now shows load test data)</w:t>
+      </w:r>
+    </w:p>
+    <w:p>
+      <w:r>
+        <w:rPr>
+          <w:b w:val="0"/>
+        </w:rPr>
+      </w:r>
+      <w:r>
+        <w:rPr>
+          <w:b/>
+        </w:rPr>
+        <w:t>What the bridge does:</w:t>
+      </w:r>
+      <w:r>
+        <w:rPr>
+          <w:b w:val="0"/>
+        </w:rPr>
+      </w:r>
+    </w:p>
+    <w:p>
+      <w:pPr>
+        <w:pStyle w:val="ListBullet"/>
+      </w:pPr>
+      <w:r>
+        <w:rPr>
+          <w:b w:val="0"/>
+        </w:rPr>
+        <w:t xml:space="preserve">Reads </w:t>
+      </w:r>
+      <w:r>
+        <w:rPr>
+          <w:rFonts w:ascii="Courier New" w:hAnsi="Courier New"/>
+          <w:b w:val="0"/>
+        </w:rPr>
+        <w:t>agent_load_details_*.json</w:t>
+      </w:r>
+      <w:r>
+        <w:rPr>
+          <w:b w:val="0"/>
+        </w:rPr>
+      </w:r>
+    </w:p>
+    <w:p>
+      <w:pPr>
+        <w:pStyle w:val="ListBullet"/>
+      </w:pPr>
+      <w:r>
+        <w:rPr>
+          <w:b w:val="0"/>
+        </w:rPr>
+        <w:t>For each request record, reconstructs span timestamps:</w:t>
+      </w:r>
+    </w:p>
+    <w:p>
+      <w:pPr>
+        <w:pStyle w:val="ListBullet"/>
+      </w:pPr>
+      <w:r>
+        <w:rPr>
+          <w:b w:val="0"/>
+        </w:rPr>
+      </w:r>
+      <w:r>
+        <w:rPr>
+          <w:rFonts w:ascii="Courier New" w:hAnsi="Courier New"/>
+          <w:b w:val="0"/>
+        </w:rPr>
+        <w:t>startTime = recorded request_time</w:t>
+      </w:r>
+      <w:r>
+        <w:rPr>
+          <w:b w:val="0"/>
+        </w:rPr>
+        <w:t xml:space="preserve"> (ISO8601)</w:t>
+      </w:r>
+    </w:p>
+    <w:p>
+      <w:pPr>
+        <w:pStyle w:val="ListBullet"/>
+      </w:pPr>
+      <w:r>
+        <w:rPr>
+          <w:b w:val="0"/>
+        </w:rPr>
+      </w:r>
+      <w:r>
+        <w:rPr>
+          <w:rFonts w:ascii="Courier New" w:hAnsi="Courier New"/>
+          <w:b w:val="0"/>
+        </w:rPr>
+        <w:t>endTime = startTime + latency_seconds</w:t>
+      </w:r>
+      <w:r>
+        <w:rPr>
+          <w:b w:val="0"/>
+        </w:rPr>
+      </w:r>
+    </w:p>
+    <w:p>
+      <w:pPr>
+        <w:pStyle w:val="ListBullet"/>
+      </w:pPr>
+      <w:r>
+        <w:rPr>
+          <w:b w:val="0"/>
+        </w:rPr>
+        <w:t xml:space="preserve">Wraps each request as a test case with one </w:t>
+      </w:r>
+      <w:r>
+        <w:rPr>
+          <w:rFonts w:ascii="Courier New" w:hAnsi="Courier New"/>
+          <w:b w:val="0"/>
+        </w:rPr>
+        <w:t>llmSpan</w:t>
+      </w:r>
+      <w:r>
+        <w:rPr>
+          <w:b w:val="0"/>
+        </w:rPr>
+        <w:t xml:space="preserve"> of type </w:t>
+      </w:r>
+      <w:r>
+        <w:rPr>
+          <w:rFonts w:ascii="Courier New" w:hAnsi="Courier New"/>
+          <w:b w:val="0"/>
+        </w:rPr>
+        <w:t>"llm"</w:t>
+      </w:r>
+      <w:r>
+        <w:rPr>
+          <w:b w:val="0"/>
+        </w:rPr>
+      </w:r>
+    </w:p>
+    <w:p>
+      <w:pPr>
+        <w:pStyle w:val="ListBullet"/>
+      </w:pPr>
+      <w:r>
+        <w:rPr>
+          <w:b w:val="0"/>
+        </w:rPr>
+        <w:t xml:space="preserve">Writes to </w:t>
+      </w:r>
+      <w:r>
+        <w:rPr>
+          <w:rFonts w:ascii="Courier New" w:hAnsi="Courier New"/>
+          <w:b w:val="0"/>
+        </w:rPr>
+        <w:t>eval_history/test_run_loadtest_TIMESTAMP.json</w:t>
+      </w:r>
+      <w:r>
+        <w:rPr>
+          <w:b w:val="0"/>
+        </w:rPr>
+      </w:r>
+    </w:p>
+    <w:p>
+      <w:pPr>
+        <w:pStyle w:val="ListBullet"/>
+      </w:pPr>
+      <w:r>
+        <w:rPr>
+          <w:b w:val="0"/>
+        </w:rPr>
+        <w:t xml:space="preserve">Sets </w:t>
+      </w:r>
+      <w:r>
+        <w:rPr>
+          <w:rFonts w:ascii="Courier New" w:hAnsi="Courier New"/>
+          <w:b w:val="0"/>
+        </w:rPr>
+        <w:t>project: "playready-loadtest"</w:t>
+      </w:r>
+      <w:r>
+        <w:rPr>
+          <w:b w:val="0"/>
+        </w:rPr>
+        <w:t xml:space="preserve"> in hyperparameters — load test runs appear as a </w:t>
+      </w:r>
+      <w:r>
+        <w:rPr>
+          <w:b/>
+        </w:rPr>
+        <w:t>separate project</w:t>
+      </w:r>
+      <w:r>
+        <w:rPr>
+          <w:b w:val="0"/>
+        </w:rPr>
+        <w:t xml:space="preserve"> in the dashboard, completely isolated from regular eval runs</w:t>
+      </w:r>
+    </w:p>
+    <w:p>
+      <w:r>
+        <w:rPr>
+          <w:b w:val="0"/>
+        </w:rPr>
+      </w:r>
+      <w:r>
+        <w:rPr>
+          <w:b/>
+        </w:rPr>
+        <w:t>Bot type support:</w:t>
+      </w:r>
+      <w:r>
+        <w:rPr>
+          <w:b w:val="0"/>
+        </w:rPr>
+        <w:t xml:space="preserve"> Pass </w:t>
+      </w:r>
+      <w:r>
+        <w:rPr>
+          <w:rFonts w:ascii="Courier New" w:hAnsi="Courier New"/>
+          <w:b w:val="0"/>
+          <w:sz w:val="20"/>
+        </w:rPr>
+        <w:t>--bot-type</w:t>
+      </w:r>
+      <w:r>
+        <w:rPr>
+          <w:b w:val="0"/>
+        </w:rPr>
+        <w:t xml:space="preserve"> to the bridge so load test runs for each bot appear under their own project:</w:t>
+      </w:r>
+    </w:p>
+    <w:p>
+      <w:pPr>
+        <w:ind w:left="432"/>
+        <w:shd w:val="clear" w:color="auto" w:fill="F2F2F2"/>
+      </w:pPr>
+      <w:r>
+        <w:rPr>
+          <w:rFonts w:ascii="Courier New" w:hAnsi="Courier New"/>
+          <w:sz w:val="18"/>
+        </w:rPr>
+        <w:t>playready-loadtest-public</w:t>
+        <w:br/>
+        <w:t>playready-loadtest-customer</w:t>
+        <w:br/>
+        <w:t>playready-loadtest-private</w:t>
+      </w:r>
+    </w:p>
+    <w:p>
+      <w:r>
+        <w:t>────────────────────────────────────────────────────────────</w:t>
+      </w:r>
+    </w:p>
+    <w:p>
+      <w:pPr>
+        <w:pStyle w:val="Heading3"/>
+      </w:pPr>
+      <w:r>
+        <w:rPr>
+          <w:b/>
+          <w:color w:val="404040"/>
+          <w:sz w:val="26"/>
+        </w:rPr>
+        <w:t>What Shows on Dashboard After Integration</w:t>
+      </w:r>
+    </w:p>
+    <w:tbl>
+      <w:tblPr>
+        <w:tblStyle w:val="TableGrid"/>
+        <w:tblW w:type="auto" w:w="0"/>
+        <w:tblLook w:firstColumn="1" w:firstRow="1" w:lastColumn="0" w:lastRow="0" w:noHBand="0" w:noVBand="1" w:val="04A0"/>
+      </w:tblPr>
+      <w:tblGrid>
+        <w:gridCol w:w="4320"/>
+        <w:gridCol w:w="4320"/>
+      </w:tblGrid>
+      <w:tr>
+        <w:tc>
+          <w:tcPr>
+            <w:tcW w:type="dxa" w:w="4320"/>
+            <w:shd w:val="clear" w:color="auto" w:fill="BDD7EE"/>
+          </w:tcPr>
+          <w:p>
+            <w:r/>
+            <w:r>
+              <w:rPr>
+                <w:b/>
+              </w:rPr>
+              <w:t>Dashboard Section</w:t>
+            </w:r>
+          </w:p>
+        </w:tc>
+        <w:tc>
+          <w:tcPr>
+            <w:tcW w:type="dxa" w:w="4320"/>
+            <w:shd w:val="clear" w:color="auto" w:fill="BDD7EE"/>
+          </w:tcPr>
+          <w:p>
+            <w:r/>
+            <w:r>
+              <w:rPr>
+                <w:b/>
+              </w:rPr>
+              <w:t>What Appears</w:t>
+            </w:r>
+          </w:p>
+        </w:tc>
+      </w:tr>
+      <w:tr>
+        <w:tc>
+          <w:tcPr>
+            <w:tcW w:type="dxa" w:w="4320"/>
+          </w:tcPr>
+          <w:p>
+            <w:r/>
+            <w:r>
+              <w:rPr>
+                <w:b w:val="0"/>
+              </w:rPr>
+              <w:t>Latency page</w:t>
+            </w:r>
+          </w:p>
+        </w:tc>
+        <w:tc>
+          <w:tcPr>
+            <w:tcW w:type="dxa" w:w="4320"/>
+          </w:tcPr>
+          <w:p>
+            <w:r/>
+            <w:r>
+              <w:rPr>
+                <w:b w:val="0"/>
+              </w:rPr>
+              <w:t>P50, P95, P99 per span type from load test runs</w:t>
+            </w:r>
+          </w:p>
+        </w:tc>
+      </w:tr>
+      <w:tr>
+        <w:tc>
+          <w:tcPr>
+            <w:tcW w:type="dxa" w:w="4320"/>
+          </w:tcPr>
+          <w:p>
+            <w:r/>
+            <w:r>
+              <w:rPr>
+                <w:b w:val="0"/>
+              </w:rPr>
+              <w:t>Projects filter</w:t>
+            </w:r>
+          </w:p>
+        </w:tc>
+        <w:tc>
+          <w:tcPr>
+            <w:tcW w:type="dxa" w:w="4320"/>
+          </w:tcPr>
+          <w:p>
+            <w:r/>
+            <w:r>
+              <w:rPr>
+                <w:b w:val="0"/>
+              </w:rPr>
+              <w:t>`playready-loadtest-*` isolated from regular eval projects</w:t>
+            </w:r>
+          </w:p>
+        </w:tc>
+      </w:tr>
+      <w:tr>
+        <w:tc>
+          <w:tcPr>
+            <w:tcW w:type="dxa" w:w="4320"/>
+          </w:tcPr>
+          <w:p>
+            <w:r/>
+            <w:r>
+              <w:rPr>
+                <w:b w:val="0"/>
+              </w:rPr>
+              <w:t>SLOs</w:t>
+            </w:r>
+          </w:p>
+        </w:tc>
+        <w:tc>
+          <w:tcPr>
+            <w:tcW w:type="dxa" w:w="4320"/>
+          </w:tcPr>
+          <w:p>
+            <w:r/>
+            <w:r>
+              <w:rPr>
+                <w:b w:val="0"/>
+              </w:rPr>
+              <w:t>Set `latency_p95 ≤ 5000ms` for load test project independently</w:t>
+            </w:r>
+          </w:p>
+        </w:tc>
+      </w:tr>
+      <w:tr>
+        <w:tc>
+          <w:tcPr>
+            <w:tcW w:type="dxa" w:w="4320"/>
+          </w:tcPr>
+          <w:p>
+            <w:r/>
+            <w:r>
+              <w:rPr>
+                <w:b w:val="0"/>
+              </w:rPr>
+              <w:t>Bug detector</w:t>
+            </w:r>
+          </w:p>
+        </w:tc>
+        <w:tc>
+          <w:tcPr>
+            <w:tcW w:type="dxa" w:w="4320"/>
+          </w:tcPr>
+          <w:p>
+            <w:r/>
+            <w:r>
+              <w:rPr>
+                <w:b w:val="0"/>
+              </w:rPr>
+              <w:t>LATENCY bug category fires if P95 exceeds 2× SLO threshold</w:t>
+            </w:r>
+          </w:p>
+        </w:tc>
+      </w:tr>
+      <w:tr>
+        <w:tc>
+          <w:tcPr>
+            <w:tcW w:type="dxa" w:w="4320"/>
+          </w:tcPr>
+          <w:p>
+            <w:r/>
+            <w:r>
+              <w:rPr>
+                <w:b w:val="0"/>
+              </w:rPr>
+              <w:t>Regular eval runs</w:t>
+            </w:r>
+          </w:p>
+        </w:tc>
+        <w:tc>
+          <w:tcPr>
+            <w:tcW w:type="dxa" w:w="4320"/>
+          </w:tcPr>
+          <w:p>
+            <w:r/>
+            <w:r>
+              <w:rPr>
+                <w:b w:val="0"/>
+              </w:rPr>
+              <w:t>Completely unaffected — different file prefix, different project</w:t>
+            </w:r>
+          </w:p>
+        </w:tc>
+      </w:tr>
+    </w:tbl>
+    <w:p/>
+    <w:p>
+      <w:r>
+        <w:t>────────────────────────────────────────────────────────────</w:t>
+      </w:r>
+    </w:p>
+    <w:p>
+      <w:pPr>
+        <w:pStyle w:val="Heading3"/>
+      </w:pPr>
+      <w:r>
+        <w:rPr>
+          <w:b/>
+          <w:color w:val="404040"/>
+          <w:sz w:val="26"/>
+        </w:rPr>
+        <w:t>File Changes for Load Test Integration</w:t>
+      </w:r>
+    </w:p>
+    <w:tbl>
+      <w:tblPr>
+        <w:tblStyle w:val="TableGrid"/>
+        <w:tblW w:type="auto" w:w="0"/>
+        <w:tblLook w:firstColumn="1" w:firstRow="1" w:lastColumn="0" w:lastRow="0" w:noHBand="0" w:noVBand="1" w:val="04A0"/>
+      </w:tblPr>
+      <w:tblGrid>
+        <w:gridCol w:w="4320"/>
+        <w:gridCol w:w="4320"/>
+      </w:tblGrid>
+      <w:tr>
+        <w:tc>
+          <w:tcPr>
+            <w:tcW w:type="dxa" w:w="4320"/>
+            <w:shd w:val="clear" w:color="auto" w:fill="BDD7EE"/>
+          </w:tcPr>
+          <w:p>
+            <w:r/>
+            <w:r>
+              <w:rPr>
+                <w:b/>
+              </w:rPr>
+              <w:t>File</w:t>
+            </w:r>
+          </w:p>
+        </w:tc>
+        <w:tc>
+          <w:tcPr>
+            <w:tcW w:type="dxa" w:w="4320"/>
+            <w:shd w:val="clear" w:color="auto" w:fill="BDD7EE"/>
+          </w:tcPr>
+          <w:p>
+            <w:r/>
+            <w:r>
+              <w:rPr>
+                <w:b/>
+              </w:rPr>
+              <w:t>Change</w:t>
+            </w:r>
+          </w:p>
+        </w:tc>
+      </w:tr>
+      <w:tr>
+        <w:tc>
+          <w:tcPr>
+            <w:tcW w:type="dxa" w:w="4320"/>
+          </w:tcPr>
+          <w:p>
+            <w:r/>
+            <w:r>
+              <w:rPr>
+                <w:b w:val="0"/>
+              </w:rPr>
+              <w:t>`scripts/load_test_to_dashboard.py`</w:t>
+            </w:r>
+          </w:p>
+        </w:tc>
+        <w:tc>
+          <w:tcPr>
+            <w:tcW w:type="dxa" w:w="4320"/>
+          </w:tcPr>
+          <w:p>
+            <w:r/>
+            <w:r>
+              <w:rPr>
+                <w:b w:val="0"/>
+              </w:rPr>
+              <w:t>NEW — bridge that converts load test JSON → `test_run_loadtest_*.json`</w:t>
+            </w:r>
+          </w:p>
+        </w:tc>
+      </w:tr>
+      <w:tr>
+        <w:tc>
+          <w:tcPr>
+            <w:tcW w:type="dxa" w:w="4320"/>
+          </w:tcPr>
+          <w:p>
+            <w:r/>
+            <w:r>
+              <w:rPr>
+                <w:b w:val="0"/>
+              </w:rPr>
+              <w:t>`scripts/run_agent_load_test.py`</w:t>
+            </w:r>
+          </w:p>
+        </w:tc>
+        <w:tc>
+          <w:tcPr>
+            <w:tcW w:type="dxa" w:w="4320"/>
+          </w:tcPr>
+          <w:p>
+            <w:r/>
+            <w:r>
+              <w:rPr>
+                <w:b w:val="0"/>
+              </w:rPr>
+              <w:t>No change — output format stays as-is</w:t>
+            </w:r>
+          </w:p>
+        </w:tc>
+      </w:tr>
+      <w:tr>
+        <w:tc>
+          <w:tcPr>
+            <w:tcW w:type="dxa" w:w="4320"/>
+          </w:tcPr>
+          <w:p>
+            <w:r/>
+            <w:r>
+              <w:rPr>
+                <w:b w:val="0"/>
+              </w:rPr>
+              <w:t>`eval_history/`</w:t>
+            </w:r>
+          </w:p>
+        </w:tc>
+        <w:tc>
+          <w:tcPr>
+            <w:tcW w:type="dxa" w:w="4320"/>
+          </w:tcPr>
+          <w:p>
+            <w:r/>
+            <w:r>
+              <w:rPr>
+                <w:b w:val="0"/>
+              </w:rPr>
+              <w:t>Receives new `test_run_loadtest_*.json` files from bridge</w:t>
+            </w:r>
+          </w:p>
+        </w:tc>
+      </w:tr>
+      <w:tr>
+        <w:tc>
+          <w:tcPr>
+            <w:tcW w:type="dxa" w:w="4320"/>
+          </w:tcPr>
+          <w:p>
+            <w:r/>
+            <w:r>
+              <w:rPr>
+                <w:b w:val="0"/>
+              </w:rPr>
+              <w:t>`.env`</w:t>
+            </w:r>
+          </w:p>
+        </w:tc>
+        <w:tc>
+          <w:tcPr>
+            <w:tcW w:type="dxa" w:w="4320"/>
+          </w:tcPr>
+          <w:p>
+            <w:r/>
+            <w:r>
+              <w:rPr>
+                <w:b w:val="0"/>
+              </w:rPr>
+              <w:t>No change needed</w:t>
+            </w:r>
+          </w:p>
+        </w:tc>
+      </w:tr>
+    </w:tbl>
+    <w:p/>
     <w:p>
       <w:r>
         <w:t>────────────────────────────────────────────────────────────</w:t>

</xml_diff>